<commit_message>
Copa Manager: Placar simples com grade e cabecalho de emojis
Substitui o layout de emoji ao lado de cada flag (repetido em toda linha) por
uma grade com cabecalho unico de icones no topo: ⚽ | 🟨 | 🟨🟨 | 🟥, com os
controles (gols/checkboxes) alinhados sob cada coluna. As linhas nao repetem
emojis, liberando espaco para o nome do atleta — que no mobile estava ficando
quase todo oculto. Cabeceho so aparece quando ha ao menos uma linha.

Atualiza spec para v1.2 (secao 5.2 + RN-LR-14).

Co-Authored-By: Claude Opus 4.8 <noreply@anthropic.com>
</commit_message>
<xml_diff>
--- a/ClaudeCode/CopaManager/CopaManager Lancamento de Resultados.docx
+++ b/ClaudeCode/CopaManager/CopaManager Lancamento de Resultados.docx
@@ -58,7 +58,7 @@
           <w:sz w:val="22"/>
           <w:szCs w:val="22"/>
         </w:rPr>
-        <w:t xml:space="preserve">Versão 1.1 (decisões resolvidas)  •  27/07/2026</w:t>
+        <w:t xml:space="preserve">Versão 1.2 (layout em colunas)  •  27/07/2026</w:t>
       </w:r>
     </w:p>
     <w:p>
@@ -669,7 +669,7 @@
           <w:bCs/>
           <w:color w:val="444444"/>
         </w:rPr>
-        <w:t xml:space="preserve">5.2. Linha do jogador</w:t>
+        <w:t xml:space="preserve">5.2. Layout em colunas com cabeçalho de emojis</w:t>
       </w:r>
     </w:p>
     <w:p>
@@ -677,24 +677,150 @@
         <w:spacing w:after="100"/>
       </w:pPr>
       <w:r>
-        <w:t xml:space="preserve">Cada jogador adicionado vira uma linha com o nome e os seguintes controles, lado a lado:</w:t>
-      </w:r>
-    </w:p>
-    <w:p>
-      <w:pPr>
-        <w:pStyle w:val="ListParagraph"/>
-        <w:numPr>
-          <w:ilvl w:val="0"/>
-          <w:numId w:val="1"/>
-        </w:numPr>
-        <w:spacing w:after="60"/>
-      </w:pPr>
-      <w:r>
-        <w:rPr>
-          <w:b/>
-          <w:bCs/>
-        </w:rPr>
-        <w:t xml:space="preserve">Gols: </w:t>
+        <w:t xml:space="preserve">A lista de cada time é organizada como uma </w:t>
+      </w:r>
+      <w:r>
+        <w:rPr>
+          <w:b/>
+          <w:bCs/>
+        </w:rPr>
+        <w:t xml:space="preserve">grade com cabeçalho</w:t>
+      </w:r>
+      <w:r>
+        <w:t xml:space="preserve">. O cabeçalho traz os ícones das colunas </w:t>
+      </w:r>
+      <w:r>
+        <w:rPr>
+          <w:b/>
+          <w:bCs/>
+        </w:rPr>
+        <w:t xml:space="preserve">uma única vez</w:t>
+      </w:r>
+      <w:r>
+        <w:t xml:space="preserve">, no topo: </w:t>
+      </w:r>
+      <w:r>
+        <w:rPr>
+          <w:b/>
+          <w:bCs/>
+        </w:rPr>
+        <w:t xml:space="preserve">⚽</w:t>
+      </w:r>
+      <w:r>
+        <w:t xml:space="preserve"> (gols)  |  </w:t>
+      </w:r>
+      <w:r>
+        <w:rPr>
+          <w:b/>
+          <w:bCs/>
+        </w:rPr>
+        <w:t xml:space="preserve">🟨</w:t>
+      </w:r>
+      <w:r>
+        <w:t xml:space="preserve"> (amarelo)  |  </w:t>
+      </w:r>
+      <w:r>
+        <w:rPr>
+          <w:b/>
+          <w:bCs/>
+        </w:rPr>
+        <w:t xml:space="preserve">🟨🟨</w:t>
+      </w:r>
+      <w:r>
+        <w:t xml:space="preserve"> (dois amarelos)  |  </w:t>
+      </w:r>
+      <w:r>
+        <w:rPr>
+          <w:b/>
+          <w:bCs/>
+        </w:rPr>
+        <w:t xml:space="preserve">🟥</w:t>
+      </w:r>
+      <w:r>
+        <w:t xml:space="preserve"> (vermelho). Abaixo de cada coluna fica apenas o controle correspondente, alinhado.</w:t>
+      </w:r>
+    </w:p>
+    <w:p>
+      <w:pPr>
+        <w:spacing w:after="100"/>
+      </w:pPr>
+      <w:r>
+        <w:rPr>
+          <w:b/>
+          <w:bCs/>
+        </w:rPr>
+        <w:t xml:space="preserve">Motivação: </w:t>
+      </w:r>
+      <w:r>
+        <w:t xml:space="preserve">no layout anterior os emojis se repetiam ao lado de cada flag, em toda linha, </w:t>
+      </w:r>
+      <w:r>
+        <w:t xml:space="preserve">consumindo espaço horizontal — no </w:t>
+      </w:r>
+      <w:r>
+        <w:rPr>
+          <w:b/>
+          <w:bCs/>
+        </w:rPr>
+        <w:t xml:space="preserve">mobile</w:t>
+      </w:r>
+      <w:r>
+        <w:t xml:space="preserve"> isso chegava a </w:t>
+      </w:r>
+      <w:r>
+        <w:rPr>
+          <w:b/>
+          <w:bCs/>
+        </w:rPr>
+        <w:t xml:space="preserve">ocultar quase todo o nome do atleta</w:t>
+      </w:r>
+      <w:r>
+        <w:t xml:space="preserve">. Com os emojis apenas no cabeçalho, cada linha fica enxuta e o nome ganha espaço.</w:t>
+      </w:r>
+    </w:p>
+    <w:p>
+      <w:pPr>
+        <w:spacing w:after="100"/>
+      </w:pPr>
+      <w:r>
+        <w:t xml:space="preserve">Cada linha de jogador tem, da esquerda para a direita:</w:t>
+      </w:r>
+    </w:p>
+    <w:p>
+      <w:pPr>
+        <w:pStyle w:val="ListParagraph"/>
+        <w:numPr>
+          <w:ilvl w:val="0"/>
+          <w:numId w:val="1"/>
+        </w:numPr>
+        <w:spacing w:after="60"/>
+      </w:pPr>
+      <w:r>
+        <w:rPr>
+          <w:b/>
+          <w:bCs/>
+        </w:rPr>
+        <w:t xml:space="preserve">Nome do jogador </w:t>
+      </w:r>
+      <w:r>
+        <w:t xml:space="preserve">(coluna flexível, à esquerda; encolhe com reticências se muito longo).</w:t>
+      </w:r>
+    </w:p>
+    <w:p>
+      <w:pPr>
+        <w:pStyle w:val="ListParagraph"/>
+        <w:numPr>
+          <w:ilvl w:val="0"/>
+          <w:numId w:val="1"/>
+        </w:numPr>
+        <w:spacing w:after="60"/>
+      </w:pPr>
+      <w:r>
+        <w:rPr>
+          <w:b/>
+          <w:bCs/>
+        </w:rPr>
+        <w:t xml:space="preserve">Coluna ⚽ — Gols: </w:t>
       </w:r>
       <w:r>
         <w:t xml:space="preserve">campo numérico (mínimo 0). Quantos gols o jogador marcou na partida.</w:t>
@@ -714,30 +840,30 @@
           <w:b/>
           <w:bCs/>
         </w:rPr>
-        <w:t xml:space="preserve">🟨 Amarelo: </w:t>
-      </w:r>
-      <w:r>
-        <w:t xml:space="preserve">flag (checkbox). Habilitado por padrão.</w:t>
-      </w:r>
-    </w:p>
-    <w:p>
-      <w:pPr>
-        <w:pStyle w:val="ListParagraph"/>
-        <w:numPr>
-          <w:ilvl w:val="0"/>
-          <w:numId w:val="1"/>
-        </w:numPr>
-        <w:spacing w:after="60"/>
-      </w:pPr>
-      <w:r>
-        <w:rPr>
-          <w:b/>
-          <w:bCs/>
-        </w:rPr>
-        <w:t xml:space="preserve">🟨🟨 Dois amarelos: </w:t>
-      </w:r>
-      <w:r>
-        <w:t xml:space="preserve">flag. Fica </w:t>
+        <w:t xml:space="preserve">Coluna 🟨 — Amarelo: </w:t>
+      </w:r>
+      <w:r>
+        <w:t xml:space="preserve">checkbox (sem texto). Habilitado por padrão.</w:t>
+      </w:r>
+    </w:p>
+    <w:p>
+      <w:pPr>
+        <w:pStyle w:val="ListParagraph"/>
+        <w:numPr>
+          <w:ilvl w:val="0"/>
+          <w:numId w:val="1"/>
+        </w:numPr>
+        <w:spacing w:after="60"/>
+      </w:pPr>
+      <w:r>
+        <w:rPr>
+          <w:b/>
+          <w:bCs/>
+        </w:rPr>
+        <w:t xml:space="preserve">Coluna 🟨🟨 — Dois amarelos: </w:t>
+      </w:r>
+      <w:r>
+        <w:t xml:space="preserve">checkbox. Fica </w:t>
       </w:r>
       <w:r>
         <w:rPr>
@@ -747,50 +873,87 @@
         <w:t xml:space="preserve">desabilitado</w:t>
       </w:r>
       <w:r>
-        <w:t xml:space="preserve"> até o flag Amarelo estar marcado.</w:t>
-      </w:r>
-    </w:p>
-    <w:p>
-      <w:pPr>
-        <w:pStyle w:val="ListParagraph"/>
-        <w:numPr>
-          <w:ilvl w:val="0"/>
-          <w:numId w:val="1"/>
-        </w:numPr>
-        <w:spacing w:after="60"/>
-      </w:pPr>
-      <w:r>
-        <w:rPr>
-          <w:b/>
-          <w:bCs/>
-        </w:rPr>
-        <w:t xml:space="preserve">🟥 Vermelho: </w:t>
-      </w:r>
-      <w:r>
-        <w:t xml:space="preserve">flag. Habilitado por padrão (vermelho direto).</w:t>
-      </w:r>
-    </w:p>
-    <w:p>
-      <w:pPr>
-        <w:pStyle w:val="ListParagraph"/>
-        <w:numPr>
-          <w:ilvl w:val="0"/>
-          <w:numId w:val="1"/>
-        </w:numPr>
-        <w:spacing w:after="60"/>
-      </w:pPr>
-      <w:r>
-        <w:t xml:space="preserve">Cada linha tem um botão para </w:t>
-      </w:r>
-      <w:r>
-        <w:rPr>
-          <w:b/>
-          <w:bCs/>
-        </w:rPr>
-        <w:t xml:space="preserve">remover</w:t>
-      </w:r>
-      <w:r>
-        <w:t xml:space="preserve"> o jogador da lista (devolve-o às opções do seletor).</w:t>
+        <w:t xml:space="preserve"> até o Amarelo estar marcado.</w:t>
+      </w:r>
+    </w:p>
+    <w:p>
+      <w:pPr>
+        <w:pStyle w:val="ListParagraph"/>
+        <w:numPr>
+          <w:ilvl w:val="0"/>
+          <w:numId w:val="1"/>
+        </w:numPr>
+        <w:spacing w:after="60"/>
+      </w:pPr>
+      <w:r>
+        <w:rPr>
+          <w:b/>
+          <w:bCs/>
+        </w:rPr>
+        <w:t xml:space="preserve">Coluna 🟥 — Vermelho: </w:t>
+      </w:r>
+      <w:r>
+        <w:t xml:space="preserve">checkbox. Habilitado por padrão (vermelho direto).</w:t>
+      </w:r>
+    </w:p>
+    <w:p>
+      <w:pPr>
+        <w:pStyle w:val="ListParagraph"/>
+        <w:numPr>
+          <w:ilvl w:val="0"/>
+          <w:numId w:val="1"/>
+        </w:numPr>
+        <w:spacing w:after="60"/>
+      </w:pPr>
+      <w:r>
+        <w:rPr>
+          <w:b/>
+          <w:bCs/>
+        </w:rPr>
+        <w:t xml:space="preserve">Botão remover </w:t>
+      </w:r>
+      <w:r>
+        <w:t xml:space="preserve">(✕) ao fim da linha — devolve o jogador às opções do seletor.</w:t>
+      </w:r>
+    </w:p>
+    <w:p>
+      <w:pPr>
+        <w:spacing w:after="100"/>
+      </w:pPr>
+      <w:r>
+        <w:rPr>
+          <w:b/>
+          <w:bCs/>
+        </w:rPr>
+        <w:t xml:space="preserve">Linha “Gol Contra”: </w:t>
+      </w:r>
+      <w:r>
+        <w:t xml:space="preserve">só a coluna </w:t>
+      </w:r>
+      <w:r>
+        <w:rPr>
+          <w:b/>
+          <w:bCs/>
+        </w:rPr>
+        <w:t xml:space="preserve">⚽</w:t>
+      </w:r>
+      <w:r>
+        <w:t xml:space="preserve"> (Gols) é preenchível; as colunas de cartão ficam vazias nessa linha.</w:t>
+      </w:r>
+    </w:p>
+    <w:p>
+      <w:pPr>
+        <w:spacing w:after="100"/>
+      </w:pPr>
+      <w:r>
+        <w:rPr>
+          <w:b/>
+          <w:bCs/>
+        </w:rPr>
+        <w:t xml:space="preserve">Alinhamento: </w:t>
+      </w:r>
+      <w:r>
+        <w:t xml:space="preserve">cabeçalho e linhas usam o mesmo template de colunas (nome flexível + larguras fixas e estreitas para ⚽/🟨/🟨🟨/🟥 e para o ✕), garantindo que os controles caiam exatamente sob seus ícones, no desktop e no mobile.</w:t>
       </w:r>
     </w:p>
     <w:p>
@@ -2166,6 +2329,52 @@
           </w:p>
         </w:tc>
       </w:tr>
+      <w:tr>
+        <w:tc>
+          <w:tcPr>
+            <w:tcW w:type="pct" w:w="12%"/>
+            <w:tcMar>
+              <w:top w:type="dxa" w:w="60"/>
+              <w:left w:type="dxa" w:w="90"/>
+              <w:bottom w:type="dxa" w:w="60"/>
+              <w:right w:type="dxa" w:w="90"/>
+            </w:tcMar>
+          </w:tcPr>
+          <w:p>
+            <w:r>
+              <w:rPr>
+                <w:b/>
+                <w:bCs/>
+                <w:sz w:val="20"/>
+                <w:szCs w:val="20"/>
+              </w:rPr>
+              <w:t xml:space="preserve">RN-LR-14</w:t>
+            </w:r>
+          </w:p>
+        </w:tc>
+        <w:tc>
+          <w:tcPr>
+            <w:tcW w:type="pct" w:w="88%"/>
+            <w:tcMar>
+              <w:top w:type="dxa" w:w="60"/>
+              <w:left w:type="dxa" w:w="90"/>
+              <w:bottom w:type="dxa" w:w="60"/>
+              <w:right w:type="dxa" w:w="90"/>
+            </w:tcMar>
+          </w:tcPr>
+          <w:p>
+            <w:r>
+              <w:rPr>
+                <w:b w:val="false"/>
+                <w:bCs w:val="false"/>
+                <w:sz w:val="20"/>
+                <w:szCs w:val="20"/>
+              </w:rPr>
+              <w:t xml:space="preserve">A lista de cada time é uma grade com cabeçalho: os ícones ⚽ | 🟨 | 🟨🟨 | 🟥 aparecem só uma vez, no topo, e cada controle (gols/checkboxes) fica alinhado sob seu ícone. As linhas não repetem emojis, para economizar espaço — especialmente no mobile, onde o nome do atleta não pode ficar oculto.</w:t>
+            </w:r>
+          </w:p>
+        </w:tc>
+      </w:tr>
     </w:tbl>
     <w:p>
       <w:pPr>
@@ -2373,10 +2582,20 @@
           <w:b/>
           <w:bCs/>
         </w:rPr>
-        <w:t xml:space="preserve">Layout dos flags: </w:t>
-      </w:r>
-      <w:r>
-        <w:t xml:space="preserve">checkboxes com emoji (🟨 / 🟨🟨 / 🟥).</w:t>
+        <w:t xml:space="preserve">Layout dos controles (v1.2): </w:t>
+      </w:r>
+      <w:r>
+        <w:t xml:space="preserve">grade com </w:t>
+      </w:r>
+      <w:r>
+        <w:rPr>
+          <w:b/>
+          <w:bCs/>
+        </w:rPr>
+        <w:t xml:space="preserve">cabeçalho de emojis</w:t>
+      </w:r>
+      <w:r>
+        <w:t xml:space="preserve"> ⚽ | 🟨 | 🟨🟨 | 🟥 no topo e, abaixo, apenas os controles alinhados em cada coluna. Substitui o layout anterior (emoji ao lado de cada flag, repetido em toda linha), que no mobile ocultava quase todo o nome do atleta. Ver seção 5.2.</w:t>
       </w:r>
     </w:p>
     <w:p>
@@ -2436,7 +2655,7 @@
         <w:t xml:space="preserve">modalResultadoGols</w:t>
       </w:r>
       <w:r>
-        <w:t xml:space="preserve">: renderizar, sob cada placar, o seletor de jogadores e as linhas com gols + flags; implementar as regras de habilitação/travamento dos cartões (RN-LR-03..05) e o contador de gols atribuídos.</w:t>
+        <w:t xml:space="preserve">: renderizar, sob cada placar, o seletor de jogadores e a grade com cabeçalho ⚽ | 🟨 | 🟨🟨 | 🟥 (RN-LR-14) e as linhas alinhadas; implementar as regras de habilitação/travamento dos cartões (RN-LR-03..05) e o contador de gols atribuídos.</w:t>
       </w:r>
     </w:p>
     <w:p>

</xml_diff>

<commit_message>
Copa Manager: Pelada Epica com grade, cabecalho e ordenacao
Lancamento de resultado da Pelada Epica passa a usar grade com cabecalho
unico: ⚽ | (Time A) | (Time B) | Fora, com gols e radios de escalacao
alinhados sob as colunas. Os nomes dos times deixam de se repetir em cada
linha, resolvendo o layout mobile (o nome do atleta ficava quase oculto).

Ordena a lista: goleiros fixos, fixos de linha, goleiros suplentes,
suplentes de linha (sort estavel preserva o ranking interno).

Atualiza spec para v1.3 (secao 12 + RN-LRP-01..05).

Co-Authored-By: Claude Opus 4.8 <noreply@anthropic.com>
</commit_message>
<xml_diff>
--- a/ClaudeCode/CopaManager/CopaManager Lancamento de Resultados.docx
+++ b/ClaudeCode/CopaManager/CopaManager Lancamento de Resultados.docx
@@ -58,7 +58,7 @@
           <w:sz w:val="22"/>
           <w:szCs w:val="22"/>
         </w:rPr>
-        <w:t xml:space="preserve">Versão 1.2 (layout em colunas)  •  27/07/2026</w:t>
+        <w:t xml:space="preserve">Versão 1.3 (layout em colunas + Pelada Épica)  •  27/07/2026</w:t>
       </w:r>
     </w:p>
     <w:p>
@@ -294,7 +294,17 @@
         <w:t xml:space="preserve">Pelada Épica</w:t>
       </w:r>
       <w:r>
-        <w:t xml:space="preserve"> — tem modal próprio (escalação obrigatória por jogador) e não usa cartões; permanece como está.</w:t>
+        <w:t xml:space="preserve"> — tem modal próprio (escalação obrigatória por jogador) e não usa cartões, então a lista de gols+cartões é exclusiva do Futebol. Porém a mesma melhoria de layout em colunas (cabeçalho único) </w:t>
+      </w:r>
+      <w:r>
+        <w:rPr>
+          <w:b/>
+          <w:bCs/>
+        </w:rPr>
+        <w:t xml:space="preserve">também se aplica ao seu modal de lançamento</w:t>
+      </w:r>
+      <w:r>
+        <w:t xml:space="preserve"> — ver seção 12.</w:t>
       </w:r>
     </w:p>
     <w:p>
@@ -2846,6 +2856,992 @@
       </w:pPr>
       <w:r>
         <w:t xml:space="preserve">Nenhuma regressão nos outros modelos (sets, pontos, Pelada Épica).</w:t>
+      </w:r>
+    </w:p>
+    <w:p>
+      <w:pPr>
+        <w:pStyle w:val="Heading1"/>
+        <w:spacing w:before="260" w:after="120"/>
+      </w:pPr>
+      <w:r>
+        <w:rPr>
+          <w:b/>
+          <w:bCs/>
+          <w:color w:val="1F6F5C"/>
+        </w:rPr>
+        <w:t xml:space="preserve">12. Extensão à Pelada Épica — lançamento em colunas</w:t>
+      </w:r>
+    </w:p>
+    <w:p>
+      <w:pPr>
+        <w:spacing w:after="100"/>
+      </w:pPr>
+      <w:r>
+        <w:t xml:space="preserve">A mesma ideia de </w:t>
+      </w:r>
+      <w:r>
+        <w:rPr>
+          <w:b/>
+          <w:bCs/>
+        </w:rPr>
+        <w:t xml:space="preserve">grade com cabeçalho</w:t>
+      </w:r>
+      <w:r>
+        <w:t xml:space="preserve"> resolve o layout do lançamento de resultado da </w:t>
+      </w:r>
+      <w:r>
+        <w:rPr>
+          <w:b/>
+          <w:bCs/>
+        </w:rPr>
+        <w:t xml:space="preserve">Pelada Épica</w:t>
+      </w:r>
+      <w:r>
+        <w:t xml:space="preserve"> (modal </w:t>
+      </w:r>
+      <w:r>
+        <w:rPr>
+          <w:sz w:val="20"/>
+          <w:szCs w:val="20"/>
+          <w:rFonts w:ascii="Consolas" w:cs="Consolas" w:eastAsia="Consolas" w:hAnsi="Consolas"/>
+        </w:rPr>
+        <w:t xml:space="preserve">modalResultadoPelada</w:t>
+      </w:r>
+      <w:r>
+        <w:t xml:space="preserve">). </w:t>
+      </w:r>
+      <w:r>
+        <w:t xml:space="preserve">Importante: o modelo da Pelada é </w:t>
+      </w:r>
+      <w:r>
+        <w:rPr>
+          <w:b/>
+          <w:bCs/>
+        </w:rPr>
+        <w:t xml:space="preserve">diferente</w:t>
+      </w:r>
+      <w:r>
+        <w:t xml:space="preserve"> — não há cartões. O que se registra por jogador é (a) </w:t>
+      </w:r>
+      <w:r>
+        <w:rPr>
+          <w:b/>
+          <w:bCs/>
+        </w:rPr>
+        <w:t xml:space="preserve">em qual time ele jogou</w:t>
+      </w:r>
+      <w:r>
+        <w:t xml:space="preserve"> — a escalação — ou </w:t>
+      </w:r>
+      <w:r>
+        <w:rPr>
+          <w:b/>
+          <w:bCs/>
+        </w:rPr>
+        <w:t xml:space="preserve">Fora</w:t>
+      </w:r>
+      <w:r>
+        <w:t xml:space="preserve"> se não jogou, e (b) </w:t>
+      </w:r>
+      <w:r>
+        <w:rPr>
+          <w:b/>
+          <w:bCs/>
+        </w:rPr>
+        <w:t xml:space="preserve">gols</w:t>
+      </w:r>
+      <w:r>
+        <w:t xml:space="preserve"> (opcional; a diferença fica sem autor, SR).</w:t>
+      </w:r>
+    </w:p>
+    <w:p>
+      <w:pPr>
+        <w:pStyle w:val="Heading2"/>
+        <w:spacing w:before="200" w:after="80"/>
+      </w:pPr>
+      <w:r>
+        <w:rPr>
+          <w:b/>
+          <w:bCs/>
+          <w:color w:val="444444"/>
+        </w:rPr>
+        <w:t xml:space="preserve">12.1. Situação atual (as-is)</w:t>
+      </w:r>
+    </w:p>
+    <w:p>
+      <w:pPr>
+        <w:pStyle w:val="ListParagraph"/>
+        <w:numPr>
+          <w:ilvl w:val="0"/>
+          <w:numId w:val="1"/>
+        </w:numPr>
+        <w:spacing w:after="60"/>
+      </w:pPr>
+      <w:r>
+        <w:t xml:space="preserve">Cada jogador é uma linha com o nome + </w:t>
+      </w:r>
+      <w:r>
+        <w:rPr>
+          <w:b/>
+          <w:bCs/>
+        </w:rPr>
+        <w:t xml:space="preserve">três opções de rádio</w:t>
+      </w:r>
+      <w:r>
+        <w:t xml:space="preserve"> (Time A, Time B, Fora), e o </w:t>
+      </w:r>
+      <w:r>
+        <w:rPr>
+          <w:b/>
+          <w:bCs/>
+        </w:rPr>
+        <w:t xml:space="preserve">nome de cada time é repetido ao lado do rádio em toda linha</w:t>
+      </w:r>
+      <w:r>
+        <w:t xml:space="preserve">, mais o campo de gols.</w:t>
+      </w:r>
+    </w:p>
+    <w:p>
+      <w:pPr>
+        <w:pStyle w:val="ListParagraph"/>
+        <w:numPr>
+          <w:ilvl w:val="0"/>
+          <w:numId w:val="1"/>
+        </w:numPr>
+        <w:spacing w:after="60"/>
+      </w:pPr>
+      <w:r>
+        <w:rPr>
+          <w:b/>
+          <w:bCs/>
+        </w:rPr>
+        <w:t xml:space="preserve">Problema: </w:t>
+      </w:r>
+      <w:r>
+        <w:t xml:space="preserve">no </w:t>
+      </w:r>
+      <w:r>
+        <w:rPr>
+          <w:b/>
+          <w:bCs/>
+        </w:rPr>
+        <w:t xml:space="preserve">mobile</w:t>
+      </w:r>
+      <w:r>
+        <w:t xml:space="preserve">, os nomes dos times repetidos linha a linha estouram a largura e </w:t>
+      </w:r>
+      <w:r>
+        <w:rPr>
+          <w:b/>
+          <w:bCs/>
+        </w:rPr>
+        <w:t xml:space="preserve">comprometem a visualização</w:t>
+      </w:r>
+      <w:r>
+        <w:t xml:space="preserve"> (rádios e nome se espremem ou quebram).</w:t>
+      </w:r>
+    </w:p>
+    <w:p>
+      <w:pPr>
+        <w:pStyle w:val="Heading2"/>
+        <w:spacing w:before="200" w:after="80"/>
+      </w:pPr>
+      <w:r>
+        <w:rPr>
+          <w:b/>
+          <w:bCs/>
+          <w:color w:val="444444"/>
+        </w:rPr>
+        <w:t xml:space="preserve">12.2. Mudança proposta (to-be)</w:t>
+      </w:r>
+    </w:p>
+    <w:p>
+      <w:pPr>
+        <w:spacing w:after="100"/>
+      </w:pPr>
+      <w:r>
+        <w:t xml:space="preserve">Um </w:t>
+      </w:r>
+      <w:r>
+        <w:rPr>
+          <w:b/>
+          <w:bCs/>
+        </w:rPr>
+        <w:t xml:space="preserve">cabeçalho único</w:t>
+      </w:r>
+      <w:r>
+        <w:t xml:space="preserve">, no topo da lista de jogadores, com as colunas: </w:t>
+      </w:r>
+      <w:r>
+        <w:rPr>
+          <w:b/>
+          <w:bCs/>
+        </w:rPr>
+        <w:t xml:space="preserve">⚽</w:t>
+      </w:r>
+      <w:r>
+        <w:t xml:space="preserve"> (gols)  |  </w:t>
+      </w:r>
+      <w:r>
+        <w:rPr>
+          <w:b/>
+          <w:bCs/>
+        </w:rPr>
+        <w:t xml:space="preserve">(Nome do Time A)</w:t>
+      </w:r>
+      <w:r>
+        <w:t xml:space="preserve">  |  </w:t>
+      </w:r>
+      <w:r>
+        <w:rPr>
+          <w:b/>
+          <w:bCs/>
+        </w:rPr>
+        <w:t xml:space="preserve">(Nome do Time B)</w:t>
+      </w:r>
+      <w:r>
+        <w:t xml:space="preserve">  |  </w:t>
+      </w:r>
+      <w:r>
+        <w:rPr>
+          <w:b/>
+          <w:bCs/>
+        </w:rPr>
+        <w:t xml:space="preserve">Fora</w:t>
+      </w:r>
+      <w:r>
+        <w:t xml:space="preserve">.</w:t>
+      </w:r>
+    </w:p>
+    <w:p>
+      <w:pPr>
+        <w:spacing w:after="100"/>
+      </w:pPr>
+      <w:r>
+        <w:t xml:space="preserve">Abaixo do cabeçalho, cada jogador é uma linha enxuta, com os controles alinhados sob cada coluna:</w:t>
+      </w:r>
+    </w:p>
+    <w:p>
+      <w:pPr>
+        <w:pStyle w:val="ListParagraph"/>
+        <w:numPr>
+          <w:ilvl w:val="0"/>
+          <w:numId w:val="1"/>
+        </w:numPr>
+        <w:spacing w:after="60"/>
+      </w:pPr>
+      <w:r>
+        <w:rPr>
+          <w:b/>
+          <w:bCs/>
+        </w:rPr>
+        <w:t xml:space="preserve">Nome do jogador </w:t>
+      </w:r>
+      <w:r>
+        <w:t xml:space="preserve">(coluna flexível à esquerda; mantém os selos </w:t>
+      </w:r>
+      <w:r>
+        <w:rPr>
+          <w:b/>
+          <w:bCs/>
+        </w:rPr>
+        <w:t xml:space="preserve">G</w:t>
+      </w:r>
+      <w:r>
+        <w:t xml:space="preserve"> de goleiro e </w:t>
+      </w:r>
+      <w:r>
+        <w:rPr>
+          <w:b/>
+          <w:bCs/>
+        </w:rPr>
+        <w:t xml:space="preserve">(sup.)</w:t>
+      </w:r>
+      <w:r>
+        <w:t xml:space="preserve"> de suplente; encolhe com reticências se longo).</w:t>
+      </w:r>
+    </w:p>
+    <w:p>
+      <w:pPr>
+        <w:pStyle w:val="ListParagraph"/>
+        <w:numPr>
+          <w:ilvl w:val="0"/>
+          <w:numId w:val="1"/>
+        </w:numPr>
+        <w:spacing w:after="60"/>
+      </w:pPr>
+      <w:r>
+        <w:rPr>
+          <w:b/>
+          <w:bCs/>
+        </w:rPr>
+        <w:t xml:space="preserve">Coluna ⚽ — Gols: </w:t>
+      </w:r>
+      <w:r>
+        <w:t xml:space="preserve">campo numérico (opcional). Gols do jogador na partida.</w:t>
+      </w:r>
+    </w:p>
+    <w:p>
+      <w:pPr>
+        <w:pStyle w:val="ListParagraph"/>
+        <w:numPr>
+          <w:ilvl w:val="0"/>
+          <w:numId w:val="1"/>
+        </w:numPr>
+        <w:spacing w:after="60"/>
+      </w:pPr>
+      <w:r>
+        <w:rPr>
+          <w:b/>
+          <w:bCs/>
+        </w:rPr>
+        <w:t xml:space="preserve">Coluna Time A / Time B: </w:t>
+      </w:r>
+      <w:r>
+        <w:t xml:space="preserve">rádio para marcar em qual time o jogador atuou (um por jogador).</w:t>
+      </w:r>
+    </w:p>
+    <w:p>
+      <w:pPr>
+        <w:pStyle w:val="ListParagraph"/>
+        <w:numPr>
+          <w:ilvl w:val="0"/>
+          <w:numId w:val="1"/>
+        </w:numPr>
+        <w:spacing w:after="60"/>
+      </w:pPr>
+      <w:r>
+        <w:rPr>
+          <w:b/>
+          <w:bCs/>
+        </w:rPr>
+        <w:t xml:space="preserve">Coluna Fora: </w:t>
+      </w:r>
+      <w:r>
+        <w:t xml:space="preserve">rádio para “não jogou” (estado padrão).</w:t>
+      </w:r>
+    </w:p>
+    <w:p>
+      <w:pPr>
+        <w:spacing w:after="100"/>
+      </w:pPr>
+      <w:r>
+        <w:rPr>
+          <w:b/>
+          <w:bCs/>
+        </w:rPr>
+        <w:t xml:space="preserve">Os nomes dos times deixam de se repetir por linha</w:t>
+      </w:r>
+      <w:r>
+        <w:t xml:space="preserve"> — aparecem só no cabeçalho, liberando espaço para o nome do atleta (o mesmo ganho obtido no Futebol).</w:t>
+      </w:r>
+    </w:p>
+    <w:p>
+      <w:pPr>
+        <w:pStyle w:val="Heading2"/>
+        <w:spacing w:before="200" w:after="80"/>
+      </w:pPr>
+      <w:r>
+        <w:rPr>
+          <w:b/>
+          <w:bCs/>
+          <w:color w:val="444444"/>
+        </w:rPr>
+        <w:t xml:space="preserve">12.2.1. Ordem da lista de jogadores</w:t>
+      </w:r>
+    </w:p>
+    <w:p>
+      <w:pPr>
+        <w:spacing w:after="100"/>
+      </w:pPr>
+      <w:r>
+        <w:t xml:space="preserve">A lista de jogadores segue uma ordem fixa, para facilitar a leitura e a escalação:</w:t>
+      </w:r>
+    </w:p>
+    <w:p>
+      <w:pPr>
+        <w:pStyle w:val="ListParagraph"/>
+        <w:numPr>
+          <w:ilvl w:val="0"/>
+          <w:numId w:val="1"/>
+        </w:numPr>
+        <w:spacing w:after="60"/>
+      </w:pPr>
+      <w:r>
+        <w:rPr>
+          <w:b/>
+          <w:bCs/>
+        </w:rPr>
+        <w:t xml:space="preserve">Fixos</w:t>
+      </w:r>
+      <w:r>
+        <w:t xml:space="preserve"> (rankeados) sempre </w:t>
+      </w:r>
+      <w:r>
+        <w:rPr>
+          <w:b/>
+          <w:bCs/>
+        </w:rPr>
+        <w:t xml:space="preserve">acima</w:t>
+      </w:r>
+      <w:r>
+        <w:t xml:space="preserve">; </w:t>
+      </w:r>
+      <w:r>
+        <w:rPr>
+          <w:b/>
+          <w:bCs/>
+        </w:rPr>
+        <w:t xml:space="preserve">suplentes</w:t>
+      </w:r>
+      <w:r>
+        <w:t xml:space="preserve"> (coringas) sempre </w:t>
+      </w:r>
+      <w:r>
+        <w:rPr>
+          <w:b/>
+          <w:bCs/>
+        </w:rPr>
+        <w:t xml:space="preserve">abaixo</w:t>
+      </w:r>
+      <w:r>
+        <w:t xml:space="preserve">.</w:t>
+      </w:r>
+    </w:p>
+    <w:p>
+      <w:pPr>
+        <w:pStyle w:val="ListParagraph"/>
+        <w:numPr>
+          <w:ilvl w:val="0"/>
+          <w:numId w:val="1"/>
+        </w:numPr>
+        <w:spacing w:after="60"/>
+      </w:pPr>
+      <w:r>
+        <w:t xml:space="preserve">Dentro de </w:t>
+      </w:r>
+      <w:r>
+        <w:rPr>
+          <w:b/>
+          <w:bCs/>
+        </w:rPr>
+        <w:t xml:space="preserve">cada</w:t>
+      </w:r>
+      <w:r>
+        <w:t xml:space="preserve"> grupo (fixos e suplentes), os </w:t>
+      </w:r>
+      <w:r>
+        <w:rPr>
+          <w:b/>
+          <w:bCs/>
+        </w:rPr>
+        <w:t xml:space="preserve">goleiros (G)</w:t>
+      </w:r>
+      <w:r>
+        <w:t xml:space="preserve"> aparecem </w:t>
+      </w:r>
+      <w:r>
+        <w:rPr>
+          <w:b/>
+          <w:bCs/>
+        </w:rPr>
+        <w:t xml:space="preserve">acima</w:t>
+      </w:r>
+      <w:r>
+        <w:t xml:space="preserve"> dos jogadores de linha.</w:t>
+      </w:r>
+    </w:p>
+    <w:p>
+      <w:pPr>
+        <w:pStyle w:val="ListParagraph"/>
+        <w:numPr>
+          <w:ilvl w:val="0"/>
+          <w:numId w:val="1"/>
+        </w:numPr>
+        <w:spacing w:after="60"/>
+      </w:pPr>
+      <w:r>
+        <w:t xml:space="preserve">Dentro de cada subgrupo (ex.: goleiros fixos), preserva-se a ordem interna atual (ranking dos fixos / ordem de cadastro dos suplentes) como critério de desempate.</w:t>
+      </w:r>
+    </w:p>
+    <w:p>
+      <w:pPr>
+        <w:spacing w:after="100"/>
+      </w:pPr>
+      <w:r>
+        <w:rPr>
+          <w:color w:val="444444"/>
+        </w:rPr>
+        <w:t xml:space="preserve">Ou seja, de cima para baixo: </w:t>
+      </w:r>
+      <w:r>
+        <w:rPr>
+          <w:i/>
+          <w:iCs/>
+          <w:color w:val="444444"/>
+        </w:rPr>
+        <w:t xml:space="preserve">goleiros fixos → fixos de linha → goleiros suplentes → suplentes de linha.</w:t>
+      </w:r>
+    </w:p>
+    <w:p>
+      <w:pPr>
+        <w:pStyle w:val="Heading2"/>
+        <w:spacing w:before="200" w:after="80"/>
+      </w:pPr>
+      <w:r>
+        <w:rPr>
+          <w:b/>
+          <w:bCs/>
+          <w:color w:val="444444"/>
+        </w:rPr>
+        <w:t xml:space="preserve">12.3. O que permanece igual</w:t>
+      </w:r>
+    </w:p>
+    <w:p>
+      <w:pPr>
+        <w:pStyle w:val="ListParagraph"/>
+        <w:numPr>
+          <w:ilvl w:val="0"/>
+          <w:numId w:val="1"/>
+        </w:numPr>
+        <w:spacing w:after="60"/>
+      </w:pPr>
+      <w:r>
+        <w:t xml:space="preserve">Os campos de placar do topo (Gols do Time A / Gols do Time B) e o texto de orientação continuam como estão.</w:t>
+      </w:r>
+    </w:p>
+    <w:p>
+      <w:pPr>
+        <w:pStyle w:val="ListParagraph"/>
+        <w:numPr>
+          <w:ilvl w:val="0"/>
+          <w:numId w:val="1"/>
+        </w:numPr>
+        <w:spacing w:after="60"/>
+      </w:pPr>
+      <w:r>
+        <w:t xml:space="preserve">A regra de escalação (marcar o time de quem jogou; a pontuação individual vem daí) e a atribuição de gols por jogador (diferença = SR) não mudam.</w:t>
+      </w:r>
+    </w:p>
+    <w:p>
+      <w:pPr>
+        <w:pStyle w:val="ListParagraph"/>
+        <w:numPr>
+          <w:ilvl w:val="0"/>
+          <w:numId w:val="1"/>
+        </w:numPr>
+        <w:spacing w:after="60"/>
+      </w:pPr>
+      <w:r>
+        <w:t xml:space="preserve">A rota de salvamento (</w:t>
+      </w:r>
+      <w:r>
+        <w:rPr>
+          <w:sz w:val="20"/>
+          <w:szCs w:val="20"/>
+          <w:rFonts w:ascii="Consolas" w:cs="Consolas" w:eastAsia="Consolas" w:hAnsi="Consolas"/>
+        </w:rPr>
+        <w:t xml:space="preserve">POST /api/jogos/:id/resultado</w:t>
+      </w:r>
+      <w:r>
+        <w:t xml:space="preserve"> com </w:t>
+      </w:r>
+      <w:r>
+        <w:rPr>
+          <w:sz w:val="20"/>
+          <w:szCs w:val="20"/>
+          <w:rFonts w:ascii="Consolas" w:cs="Consolas" w:eastAsia="Consolas" w:hAnsi="Consolas"/>
+        </w:rPr>
+        <w:t xml:space="preserve">escalacoes</w:t>
+      </w:r>
+      <w:r>
+        <w:t xml:space="preserve"> + </w:t>
+      </w:r>
+      <w:r>
+        <w:rPr>
+          <w:sz w:val="20"/>
+          <w:szCs w:val="20"/>
+          <w:rFonts w:ascii="Consolas" w:cs="Consolas" w:eastAsia="Consolas" w:hAnsi="Consolas"/>
+        </w:rPr>
+        <w:t xml:space="preserve">eventos</w:t>
+      </w:r>
+      <w:r>
+        <w:t xml:space="preserve"> de gol) e o backend </w:t>
+      </w:r>
+      <w:r>
+        <w:rPr>
+          <w:b/>
+          <w:bCs/>
+        </w:rPr>
+        <w:t xml:space="preserve">não mudam</w:t>
+      </w:r>
+      <w:r>
+        <w:t xml:space="preserve"> — é alteração só de apresentação, sem migração de banco.</w:t>
+      </w:r>
+    </w:p>
+    <w:p>
+      <w:pPr>
+        <w:pStyle w:val="ListParagraph"/>
+        <w:numPr>
+          <w:ilvl w:val="0"/>
+          <w:numId w:val="1"/>
+        </w:numPr>
+        <w:spacing w:after="60"/>
+      </w:pPr>
+      <w:r>
+        <w:t xml:space="preserve">Não há cartões na Pelada Épica: as colunas 🟨 / 🟨🟨 / 🟥 do Futebol NÃO aparecem aqui.</w:t>
+      </w:r>
+    </w:p>
+    <w:p>
+      <w:pPr>
+        <w:pStyle w:val="Heading2"/>
+        <w:spacing w:before="200" w:after="80"/>
+      </w:pPr>
+      <w:r>
+        <w:rPr>
+          <w:b/>
+          <w:bCs/>
+          <w:color w:val="444444"/>
+        </w:rPr>
+        <w:t xml:space="preserve">12.4. Regras</w:t>
+      </w:r>
+    </w:p>
+    <w:tbl>
+      <w:tblPr>
+        <w:tblW w:type="pct" w:w="100%"/>
+        <w:tblBorders>
+          <w:top w:val="single" w:color="C7D9D1" w:sz="4"/>
+          <w:left w:val="single" w:color="C7D9D1" w:sz="4"/>
+          <w:bottom w:val="single" w:color="C7D9D1" w:sz="4"/>
+          <w:right w:val="single" w:color="C7D9D1" w:sz="4"/>
+          <w:insideH w:val="single" w:color="C7D9D1" w:sz="4"/>
+          <w:insideV w:val="single" w:color="C7D9D1" w:sz="4"/>
+        </w:tblBorders>
+      </w:tblPr>
+      <w:tblGrid>
+        <w:gridCol w:w="100"/>
+        <w:gridCol w:w="100"/>
+      </w:tblGrid>
+      <w:tr>
+        <w:trPr>
+          <w:tblHeader/>
+        </w:trPr>
+        <w:tc>
+          <w:tcPr>
+            <w:tcW w:type="pct" w:w="12%"/>
+            <w:shd w:fill="E8F3EE" w:val="clear"/>
+            <w:tcMar>
+              <w:top w:type="dxa" w:w="60"/>
+              <w:left w:type="dxa" w:w="90"/>
+              <w:bottom w:type="dxa" w:w="60"/>
+              <w:right w:type="dxa" w:w="90"/>
+            </w:tcMar>
+          </w:tcPr>
+          <w:p>
+            <w:r>
+              <w:rPr>
+                <w:b/>
+                <w:bCs/>
+                <w:sz w:val="20"/>
+                <w:szCs w:val="20"/>
+              </w:rPr>
+              <w:t xml:space="preserve">ID</w:t>
+            </w:r>
+          </w:p>
+        </w:tc>
+        <w:tc>
+          <w:tcPr>
+            <w:tcW w:type="pct" w:w="88%"/>
+            <w:shd w:fill="E8F3EE" w:val="clear"/>
+            <w:tcMar>
+              <w:top w:type="dxa" w:w="60"/>
+              <w:left w:type="dxa" w:w="90"/>
+              <w:bottom w:type="dxa" w:w="60"/>
+              <w:right w:type="dxa" w:w="90"/>
+            </w:tcMar>
+          </w:tcPr>
+          <w:p>
+            <w:r>
+              <w:rPr>
+                <w:b/>
+                <w:bCs/>
+                <w:sz w:val="20"/>
+                <w:szCs w:val="20"/>
+              </w:rPr>
+              <w:t xml:space="preserve">Regra de negócio</w:t>
+            </w:r>
+          </w:p>
+        </w:tc>
+      </w:tr>
+      <w:tr>
+        <w:tc>
+          <w:tcPr>
+            <w:tcW w:type="pct" w:w="12%"/>
+            <w:tcMar>
+              <w:top w:type="dxa" w:w="60"/>
+              <w:left w:type="dxa" w:w="90"/>
+              <w:bottom w:type="dxa" w:w="60"/>
+              <w:right w:type="dxa" w:w="90"/>
+            </w:tcMar>
+          </w:tcPr>
+          <w:p>
+            <w:r>
+              <w:rPr>
+                <w:b/>
+                <w:bCs/>
+                <w:sz w:val="20"/>
+                <w:szCs w:val="20"/>
+              </w:rPr>
+              <w:t xml:space="preserve">RN-LRP-01</w:t>
+            </w:r>
+          </w:p>
+        </w:tc>
+        <w:tc>
+          <w:tcPr>
+            <w:tcW w:type="pct" w:w="88%"/>
+            <w:tcMar>
+              <w:top w:type="dxa" w:w="60"/>
+              <w:left w:type="dxa" w:w="90"/>
+              <w:bottom w:type="dxa" w:w="60"/>
+              <w:right w:type="dxa" w:w="90"/>
+            </w:tcMar>
+          </w:tcPr>
+          <w:p>
+            <w:r>
+              <w:rPr>
+                <w:b w:val="false"/>
+                <w:bCs w:val="false"/>
+                <w:sz w:val="20"/>
+                <w:szCs w:val="20"/>
+              </w:rPr>
+              <w:t xml:space="preserve">O lançamento da Pelada Épica usa uma grade com cabeçalho único: ⚽ | (Nome Time A) | (Nome Time B) | Fora. Os nomes dos times aparecem só no cabeçalho, não em cada linha.</w:t>
+            </w:r>
+          </w:p>
+        </w:tc>
+      </w:tr>
+      <w:tr>
+        <w:tc>
+          <w:tcPr>
+            <w:tcW w:type="pct" w:w="12%"/>
+            <w:tcMar>
+              <w:top w:type="dxa" w:w="60"/>
+              <w:left w:type="dxa" w:w="90"/>
+              <w:bottom w:type="dxa" w:w="60"/>
+              <w:right w:type="dxa" w:w="90"/>
+            </w:tcMar>
+          </w:tcPr>
+          <w:p>
+            <w:r>
+              <w:rPr>
+                <w:b/>
+                <w:bCs/>
+                <w:sz w:val="20"/>
+                <w:szCs w:val="20"/>
+              </w:rPr>
+              <w:t xml:space="preserve">RN-LRP-02</w:t>
+            </w:r>
+          </w:p>
+        </w:tc>
+        <w:tc>
+          <w:tcPr>
+            <w:tcW w:type="pct" w:w="88%"/>
+            <w:tcMar>
+              <w:top w:type="dxa" w:w="60"/>
+              <w:left w:type="dxa" w:w="90"/>
+              <w:bottom w:type="dxa" w:w="60"/>
+              <w:right w:type="dxa" w:w="90"/>
+            </w:tcMar>
+          </w:tcPr>
+          <w:p>
+            <w:r>
+              <w:rPr>
+                <w:b w:val="false"/>
+                <w:bCs w:val="false"/>
+                <w:sz w:val="20"/>
+                <w:szCs w:val="20"/>
+              </w:rPr>
+              <w:t xml:space="preserve">Cada jogador é uma linha: nome (com selos G/sup.) | campo de gols (sob ⚽) | rádio Time A | rádio Time B | rádio Fora. Um único rádio selecionável por jogador.</w:t>
+            </w:r>
+          </w:p>
+        </w:tc>
+      </w:tr>
+      <w:tr>
+        <w:tc>
+          <w:tcPr>
+            <w:tcW w:type="pct" w:w="12%"/>
+            <w:tcMar>
+              <w:top w:type="dxa" w:w="60"/>
+              <w:left w:type="dxa" w:w="90"/>
+              <w:bottom w:type="dxa" w:w="60"/>
+              <w:right w:type="dxa" w:w="90"/>
+            </w:tcMar>
+          </w:tcPr>
+          <w:p>
+            <w:r>
+              <w:rPr>
+                <w:b/>
+                <w:bCs/>
+                <w:sz w:val="20"/>
+                <w:szCs w:val="20"/>
+              </w:rPr>
+              <w:t xml:space="preserve">RN-LRP-03</w:t>
+            </w:r>
+          </w:p>
+        </w:tc>
+        <w:tc>
+          <w:tcPr>
+            <w:tcW w:type="pct" w:w="88%"/>
+            <w:tcMar>
+              <w:top w:type="dxa" w:w="60"/>
+              <w:left w:type="dxa" w:w="90"/>
+              <w:bottom w:type="dxa" w:w="60"/>
+              <w:right w:type="dxa" w:w="90"/>
+            </w:tcMar>
+          </w:tcPr>
+          <w:p>
+            <w:r>
+              <w:rPr>
+                <w:b w:val="false"/>
+                <w:bCs w:val="false"/>
+                <w:sz w:val="20"/>
+                <w:szCs w:val="20"/>
+              </w:rPr>
+              <w:t xml:space="preserve">Cabeçalho e linhas compartilham o mesmo template de colunas, alinhando os rádios sob os respectivos times; nomes de time longos truncam com reticências em telas estreitas.</w:t>
+            </w:r>
+          </w:p>
+        </w:tc>
+      </w:tr>
+      <w:tr>
+        <w:tc>
+          <w:tcPr>
+            <w:tcW w:type="pct" w:w="12%"/>
+            <w:tcMar>
+              <w:top w:type="dxa" w:w="60"/>
+              <w:left w:type="dxa" w:w="90"/>
+              <w:bottom w:type="dxa" w:w="60"/>
+              <w:right w:type="dxa" w:w="90"/>
+            </w:tcMar>
+          </w:tcPr>
+          <w:p>
+            <w:r>
+              <w:rPr>
+                <w:b/>
+                <w:bCs/>
+                <w:sz w:val="20"/>
+                <w:szCs w:val="20"/>
+              </w:rPr>
+              <w:t xml:space="preserve">RN-LRP-04</w:t>
+            </w:r>
+          </w:p>
+        </w:tc>
+        <w:tc>
+          <w:tcPr>
+            <w:tcW w:type="pct" w:w="88%"/>
+            <w:tcMar>
+              <w:top w:type="dxa" w:w="60"/>
+              <w:left w:type="dxa" w:w="90"/>
+              <w:bottom w:type="dxa" w:w="60"/>
+              <w:right w:type="dxa" w:w="90"/>
+            </w:tcMar>
+          </w:tcPr>
+          <w:p>
+            <w:r>
+              <w:rPr>
+                <w:b w:val="false"/>
+                <w:bCs w:val="false"/>
+                <w:sz w:val="20"/>
+                <w:szCs w:val="20"/>
+              </w:rPr>
+              <w:t xml:space="preserve">Sem cartões: a Pelada Épica não exibe as colunas de cartão. A escalação, os gols por jogador e a rota de salvamento permanecem inalterados (sem mudança de banco).</w:t>
+            </w:r>
+          </w:p>
+        </w:tc>
+      </w:tr>
+      <w:tr>
+        <w:tc>
+          <w:tcPr>
+            <w:tcW w:type="pct" w:w="12%"/>
+            <w:tcMar>
+              <w:top w:type="dxa" w:w="60"/>
+              <w:left w:type="dxa" w:w="90"/>
+              <w:bottom w:type="dxa" w:w="60"/>
+              <w:right w:type="dxa" w:w="90"/>
+            </w:tcMar>
+          </w:tcPr>
+          <w:p>
+            <w:r>
+              <w:rPr>
+                <w:b/>
+                <w:bCs/>
+                <w:sz w:val="20"/>
+                <w:szCs w:val="20"/>
+              </w:rPr>
+              <w:t xml:space="preserve">RN-LRP-05</w:t>
+            </w:r>
+          </w:p>
+        </w:tc>
+        <w:tc>
+          <w:tcPr>
+            <w:tcW w:type="pct" w:w="88%"/>
+            <w:tcMar>
+              <w:top w:type="dxa" w:w="60"/>
+              <w:left w:type="dxa" w:w="90"/>
+              <w:bottom w:type="dxa" w:w="60"/>
+              <w:right w:type="dxa" w:w="90"/>
+            </w:tcMar>
+          </w:tcPr>
+          <w:p>
+            <w:r>
+              <w:rPr>
+                <w:b w:val="false"/>
+                <w:bCs w:val="false"/>
+                <w:sz w:val="20"/>
+                <w:szCs w:val="20"/>
+              </w:rPr>
+              <w:t xml:space="preserve">A lista é ordenada: fixos acima, suplentes abaixo; dentro de cada grupo, goleiros (G) acima dos jogadores de linha. Ordem final (topo→base): goleiros fixos, fixos de linha, goleiros suplentes, suplentes de linha — preservando a ordem interna existente como desempate.</w:t>
+            </w:r>
+          </w:p>
+        </w:tc>
+      </w:tr>
+    </w:tbl>
+    <w:p>
+      <w:pPr>
+        <w:pStyle w:val="Heading2"/>
+        <w:spacing w:before="200" w:after="80"/>
+      </w:pPr>
+      <w:r>
+        <w:rPr>
+          <w:b/>
+          <w:bCs/>
+          <w:color w:val="444444"/>
+        </w:rPr>
+        <w:t xml:space="preserve">12.5. Verificação</w:t>
+      </w:r>
+    </w:p>
+    <w:p>
+      <w:pPr>
+        <w:pStyle w:val="ListParagraph"/>
+        <w:numPr>
+          <w:ilvl w:val="0"/>
+          <w:numId w:val="1"/>
+        </w:numPr>
+        <w:spacing w:after="60"/>
+      </w:pPr>
+      <w:r>
+        <w:t xml:space="preserve">Desktop e mobile (~390px): cabeçalho alinhado; nome do atleta legível; rádios sob os times corretos.</w:t>
+      </w:r>
+    </w:p>
+    <w:p>
+      <w:pPr>
+        <w:pStyle w:val="ListParagraph"/>
+        <w:numPr>
+          <w:ilvl w:val="0"/>
+          <w:numId w:val="1"/>
+        </w:numPr>
+        <w:spacing w:after="60"/>
+      </w:pPr>
+      <w:r>
+        <w:t xml:space="preserve">Round-trip: marcar time + gols, salvar e reabrir reflete a escalação e os gols; nenhuma regressão na pontuação individual da Pelada.</w:t>
       </w:r>
     </w:p>
     <w:sectPr>

</xml_diff>